<commit_message>
ISEE abstract version sent to Dietrich
</commit_message>
<xml_diff>
--- a/abstracts/ISEE_2026.docx
+++ b/abstracts/ISEE_2026.docx
@@ -60,17 +60,6 @@
       </w:pPr>
       <w:r>
         <w:t xml:space="preserve">Deadline: February 27, 2026 (23:59 CET)</w:t>
-      </w:r>
-    </w:p>
-    <w:p>
-      <w:pPr>
-        <w:numPr>
-          <w:ilvl w:val="0"/>
-          <w:numId w:val="1001"/>
-        </w:numPr>
-      </w:pPr>
-      <w:r>
-        <w:t xml:space="preserve">The submitting author is required to ensure that all co-authors are aware of the content of the abstract before submission</w:t>
       </w:r>
     </w:p>
     <w:p>
@@ -192,7 +181,23 @@
         </w:numPr>
       </w:pPr>
       <w:r>
-        <w:t xml:space="preserve">A main topic that is relevant for your abstract must be selected during the submission process.</w:t>
+        <w:t xml:space="preserve">A</w:t>
+      </w:r>
+      <w:r>
+        <w:t xml:space="preserve"> </w:t>
+      </w:r>
+      <w:r>
+        <w:rPr>
+          <w:b/>
+          <w:bCs/>
+        </w:rPr>
+        <w:t xml:space="preserve">main topic</w:t>
+      </w:r>
+      <w:r>
+        <w:t xml:space="preserve"> </w:t>
+      </w:r>
+      <w:r>
+        <w:t xml:space="preserve">that is relevant for your abstract must be selected during the submission process.</w:t>
       </w:r>
       <w:r>
         <w:t xml:space="preserve"> </w:t>
@@ -209,7 +214,23 @@
         </w:numPr>
       </w:pPr>
       <w:r>
-        <w:t xml:space="preserve">Please enter at least 2 to 5 keywords from the official keyword list</w:t>
+        <w:t xml:space="preserve">Please enter</w:t>
+      </w:r>
+      <w:r>
+        <w:t xml:space="preserve"> </w:t>
+      </w:r>
+      <w:r>
+        <w:rPr>
+          <w:b/>
+          <w:bCs/>
+        </w:rPr>
+        <w:t xml:space="preserve">2 to 5 keywords</w:t>
+      </w:r>
+      <w:r>
+        <w:t xml:space="preserve"> </w:t>
+      </w:r>
+      <w:r>
+        <w:t xml:space="preserve">from the official keyword list</w:t>
       </w:r>
     </w:p>
     <w:p>
@@ -220,7 +241,7 @@
         </w:numPr>
       </w:pPr>
       <w:r>
-        <w:t xml:space="preserve">Topic: A-10: Chemical exposures / A-18: Methods ?</w:t>
+        <w:t xml:space="preserve">Topic: A-10: Chemical exposures / A-18: Methods (?)</w:t>
       </w:r>
     </w:p>
     <w:p>
@@ -231,7 +252,7 @@
         </w:numPr>
       </w:pPr>
       <w:r>
-        <w:t xml:space="preserve">Keywords: Chemical exposures, Environmental epidemiology, Heavy metals, Lead, International collaboration, Modeling</w:t>
+        <w:t xml:space="preserve">Keywords: Chemical exposures, Environmental epidemiology, Heavy metals, Lead, International collaboration, Modeling (?)</w:t>
       </w:r>
     </w:p>
     <w:bookmarkEnd w:id="20"/>
@@ -244,13 +265,13 @@
         <w:t xml:space="preserve">Abstract</w:t>
       </w:r>
     </w:p>
-    <w:bookmarkStart w:id="21" w:name="X2176ffeca05b83879dc5a063374505014243af9"/>
+    <w:bookmarkStart w:id="21" w:name="X67c926780bbff0042b1427218edfdcd75480539"/>
     <w:p>
       <w:pPr>
         <w:pStyle w:val="Heading3"/>
       </w:pPr>
       <w:r>
-        <w:t xml:space="preserve">Understanding uncertainty: Comparative Bayesian and frequentist meta-analysis of epidemiological studies on lead exposure and IQ loss in children</w:t>
+        <w:t xml:space="preserve">Quantifying uncertainty: A methodological comparison of Bayesian and frequentist meta-analyses of lead exposure and children’s neurodevelopment</w:t>
       </w:r>
     </w:p>
     <w:bookmarkEnd w:id="21"/>
@@ -268,25 +289,19 @@
         <w:pStyle w:val="FirstParagraph"/>
       </w:pPr>
       <w:r>
-        <w:t xml:space="preserve">Evidence synthesis in epidemiology is often done by meta-analysis, primarily using a frequentist approach.</w:t>
-      </w:r>
-      <w:r>
-        <w:t xml:space="preserve"> </w:t>
-      </w:r>
-      <w:r>
-        <w:t xml:space="preserve">Bayesian meta-analysis offers an alternative framework for uncertainty quantification, incorporating within-study and between-study variability and facilitating transparent communication of uncertainty.</w:t>
-      </w:r>
-      <w:r>
-        <w:t xml:space="preserve"> </w:t>
-      </w:r>
-      <w:r>
-        <w:t xml:space="preserve">We compared frequentist and Bayesian frameworks to investigate how they differ in exposure-response estimates, uncertainty characterization, and applicability for risk assessment.</w:t>
-      </w:r>
-      <w:r>
-        <w:t xml:space="preserve"> </w:t>
-      </w:r>
-      <w:r>
-        <w:t xml:space="preserve">We used the association of blood lead levels and children’s neurodevelopment as a use-case.</w:t>
+        <w:t xml:space="preserve">Bayesian meta-analysis provides probabilistic uncertainty quantification valuable for risk assessment and policy-making.</w:t>
+      </w:r>
+      <w:r>
+        <w:t xml:space="preserve"> </w:t>
+      </w:r>
+      <w:r>
+        <w:t xml:space="preserve">Yet, frequentist approaches dominate in environmental epidemiology.</w:t>
+      </w:r>
+      <w:r>
+        <w:t xml:space="preserve"> </w:t>
+      </w:r>
+      <w:r>
+        <w:t xml:space="preserve">We compared frequentist and Bayesian frameworks to evaluate differences in pooled effect estimates, uncertainty characterization, and applicability for risk assessment, using blood lead exposure and children’s neurodevelopment as a case study.</w:t>
       </w:r>
     </w:p>
     <w:bookmarkEnd w:id="22"/>
@@ -304,25 +319,13 @@
         <w:pStyle w:val="FirstParagraph"/>
       </w:pPr>
       <w:r>
-        <w:t xml:space="preserve">We systematically searched PubMed and Scopus for epidemiological studies on blood lead levels and IQ score in children.</w:t>
-      </w:r>
-      <w:r>
-        <w:t xml:space="preserve"> </w:t>
-      </w:r>
-      <w:r>
-        <w:t xml:space="preserve">Risk of bias (RoB) was assessed using a rapid RoB tool</w:t>
-      </w:r>
-      <w:r>
-        <w:t xml:space="preserve"> </w:t>
-      </w:r>
-      <w:r>
-        <w:t xml:space="preserve">(1)</w:t>
-      </w:r>
-      <w:r>
-        <w:t xml:space="preserve"> </w:t>
-      </w:r>
-      <w:r>
-        <w:t xml:space="preserve">and regression coefficients were harmonized to the</w:t>
+        <w:t xml:space="preserve">We systematically searched PubMed and Scopus for epidemiological studies on lead exposure and IQ score in children.</w:t>
+      </w:r>
+      <w:r>
+        <w:t xml:space="preserve"> </w:t>
+      </w:r>
+      <w:r>
+        <w:t xml:space="preserve">Risk of bias (RoB) was assessed and regression coefficients were harmonized to the</w:t>
       </w:r>
       <w:r>
         <w:t xml:space="preserve"> </w:t>
@@ -351,13 +354,7 @@
         <w:t xml:space="preserve"> </w:t>
       </w:r>
       <w:r>
-        <w:t xml:space="preserve">We assumed a multilevel structure and used random-effects models.</w:t>
-      </w:r>
-      <w:r>
-        <w:t xml:space="preserve"> </w:t>
-      </w:r>
-      <w:r>
-        <w:t xml:space="preserve">We included the same effect estimates for both approaches.</w:t>
+        <w:t xml:space="preserve">In both meta-analyses, we assumed a multilevel structure, used random-effects models and included identical effect estimates.</w:t>
       </w:r>
       <w:r>
         <w:t xml:space="preserve"> </w:t>
@@ -370,12 +367,6 @@
       </w:r>
       <w:r>
         <w:t xml:space="preserve">The Bayesian meta-analysis employed a hierarchical model with weakly-informative priors.</w:t>
-      </w:r>
-      <w:r>
-        <w:t xml:space="preserve"> </w:t>
-      </w:r>
-      <w:r>
-        <w:t xml:space="preserve">Posterior distributions of parameters were obtained using Markov Chain Monte Carlo.</w:t>
       </w:r>
       <w:r>
         <w:t xml:space="preserve"> </w:t>
@@ -404,7 +395,7 @@
         <w:t xml:space="preserve"> </w:t>
       </w:r>
       <w:r>
-        <w:t xml:space="preserve">was calculated as a measure of between-study heterogeneity in the frequentist approach and directly modelled in the Bayesian approach.</w:t>
+        <w:t xml:space="preserve">was estimated as a measure of between-study heterogeneity.</w:t>
       </w:r>
     </w:p>
     <w:bookmarkEnd w:id="23"/>
@@ -451,13 +442,13 @@
         </m:sSub>
       </m:oMath>
       <w:r>
-        <w:t xml:space="preserve">-transformed BLL (in µg/dL).</w:t>
-      </w:r>
-      <w:r>
-        <w:t xml:space="preserve"> </w:t>
-      </w:r>
-      <w:r>
-        <w:t xml:space="preserve">The Bayesian model yielded a mean pooled estimate of -2.15 (95% high density interval (HDI): -3.48; -0.92).</w:t>
+        <w:t xml:space="preserve">-transformed BLL (µg/dL).</w:t>
+      </w:r>
+      <w:r>
+        <w:t xml:space="preserve"> </w:t>
+      </w:r>
+      <w:r>
+        <w:t xml:space="preserve">The Bayesian model yielded a mean pooled estimate of -2.15 (95% credible interval (CrI): -3.48; -0.92).</w:t>
       </w:r>
       <w:r>
         <w:t xml:space="preserve"> </w:t>
@@ -536,7 +527,7 @@
         <w:t xml:space="preserve"> </w:t>
       </w:r>
       <w:r>
-        <w:t xml:space="preserve">= 4.32 [95% credible interval (CrI): 1.28; 10.6],</w:t>
+        <w:t xml:space="preserve">= 4.32 [95% CrI: 1.28; 10.6],</w:t>
       </w:r>
       <w:r>
         <w:t xml:space="preserve"> </w:t>
@@ -563,7 +554,7 @@
         <w:t xml:space="preserve"> </w:t>
       </w:r>
       <w:r>
-        <w:t xml:space="preserve">= 71.2% [95% CrI: 52.7%; 86.2%]).</w:t>
+        <w:t xml:space="preserve">= 98.3% [95% CrI: 95.8%; 99.5%]).</w:t>
       </w:r>
       <w:r>
         <w:t xml:space="preserve"> </w:t>
@@ -575,13 +566,13 @@
         <w:t xml:space="preserve"> </w:t>
       </w:r>
       <w:r>
-        <w:t xml:space="preserve">Sensitivity analyses showed robustness to RoB assessment and prior choice.</w:t>
-      </w:r>
-      <w:r>
-        <w:t xml:space="preserve"> </w:t>
-      </w:r>
-      <w:r>
-        <w:t xml:space="preserve">The Bayesian approach was less sensitive to outlier studies that reported wide confidence intervals, resulting in a lower pooled effect compared to the frequentist analysis.</w:t>
+        <w:t xml:space="preserve">Sensitivity analyses showed robustness to RoB and prior specification.</w:t>
+      </w:r>
+      <w:r>
+        <w:t xml:space="preserve"> </w:t>
+      </w:r>
+      <w:r>
+        <w:t xml:space="preserve">The Bayesian approach was less sensitive to outlier studies, resulting in a lower pooled effect.</w:t>
       </w:r>
     </w:p>
     <w:bookmarkEnd w:id="24"/>
@@ -605,13 +596,13 @@
         <w:br/>
       </w:r>
       <w:r>
-        <w:t xml:space="preserve">The Bayesian approach offered distinct advantages for uncertainty quantification as the posterior distributions enable direct probability statements.</w:t>
-      </w:r>
-      <w:r>
-        <w:t xml:space="preserve"> </w:t>
-      </w:r>
-      <w:r>
-        <w:t xml:space="preserve">This is especially useful for risk assessments and policy making, as it allows defining relevant risk thresholds and calculating the probability of exceeding them, enabling comparative risk evaluation across pollutants.</w:t>
+        <w:t xml:space="preserve">The Bayesian approach enables direct probability statements through posterior distributions.</w:t>
+      </w:r>
+      <w:r>
+        <w:t xml:space="preserve"> </w:t>
+      </w:r>
+      <w:r>
+        <w:t xml:space="preserve">For risk assessment and policy making, this allows defining risk thresholds and calculating exceedance probabilities, enabling comparative assessments across pollutants.</w:t>
       </w:r>
     </w:p>
     <w:p>
@@ -619,59 +610,11 @@
         <w:pStyle w:val="BodyText"/>
       </w:pPr>
       <w:r>
-        <w:t xml:space="preserve">Funding</w:t>
+        <w:t xml:space="preserve">Funded under EU Horizon (Grant Agreement No 101057014).</w:t>
       </w:r>
     </w:p>
     <w:bookmarkEnd w:id="25"/>
     <w:bookmarkEnd w:id="26"/>
-    <w:bookmarkStart w:id="30" w:name="bibliography"/>
-    <w:p>
-      <w:pPr>
-        <w:pStyle w:val="Heading1"/>
-      </w:pPr>
-      <w:r>
-        <w:t xml:space="preserve">References</w:t>
-      </w:r>
-    </w:p>
-    <w:bookmarkStart w:id="29" w:name="refs"/>
-    <w:bookmarkStart w:id="28" w:name="ref-plate2024DevelopmentToolRapid"/>
-    <w:p>
-      <w:pPr>
-        <w:pStyle w:val="Bibliography"/>
-      </w:pPr>
-      <w:r>
-        <w:t xml:space="preserve">1.</w:t>
-      </w:r>
-      <w:r>
-        <w:t xml:space="preserve"> </w:t>
-      </w:r>
-      <w:r>
-        <w:t xml:space="preserve">	</w:t>
-      </w:r>
-      <w:r>
-        <w:t xml:space="preserve">Plate K, Knüppel S, Hornbacher A, Greiner M, Müller-Graf C.</w:t>
-      </w:r>
-      <w:r>
-        <w:t xml:space="preserve"> </w:t>
-      </w:r>
-      <w:hyperlink r:id="rId27">
-        <w:r>
-          <w:rPr>
-            <w:rStyle w:val="Hyperlink"/>
-          </w:rPr>
-          <w:t xml:space="preserve">Development of a tool for rapid assessment of the evidence of human observational epidemiological studies with focus on risk of bias in the context of public health and risk assessment</w:t>
-        </w:r>
-      </w:hyperlink>
-      <w:r>
-        <w:t xml:space="preserve">. EFS3. 2024 Jul;21(7).</w:t>
-      </w:r>
-      <w:r>
-        <w:t xml:space="preserve"> </w:t>
-      </w:r>
-    </w:p>
-    <w:bookmarkEnd w:id="28"/>
-    <w:bookmarkEnd w:id="29"/>
-    <w:bookmarkEnd w:id="30"/>
     <w:sectPr>
       <w:footnotePr>
         <w:numRestart w:val="eachSect"/>

</xml_diff>

<commit_message>
ISEE abstract version after comments from DP
</commit_message>
<xml_diff>
--- a/abstracts/ISEE_2026.docx
+++ b/abstracts/ISEE_2026.docx
@@ -17,29 +17,70 @@
       <w:r>
         <w:t xml:space="preserve">Paulina Sell</w:t>
       </w:r>
-    </w:p>
-    <w:p>
-      <w:pPr>
-        <w:pStyle w:val="Author"/>
-      </w:pPr>
-      <w:r>
-        <w:t xml:space="preserve">Margaux Sanchez</w:t>
-      </w:r>
-    </w:p>
-    <w:p>
-      <w:pPr>
-        <w:pStyle w:val="Author"/>
-      </w:pPr>
-      <w:r>
-        <w:t xml:space="preserve">Philippe Palmont</w:t>
-      </w:r>
-    </w:p>
-    <w:p>
-      <w:pPr>
-        <w:pStyle w:val="Author"/>
-      </w:pPr>
-      <w:r>
-        <w:t xml:space="preserve">Dietrich Plass</w:t>
+      <w:r>
+        <w:rPr>
+          <w:vertAlign w:val="superscript"/>
+        </w:rPr>
+        <w:t xml:space="preserve">1</w:t>
+      </w:r>
+      <w:r>
+        <w:t xml:space="preserve">, Margaux Sanchez</w:t>
+      </w:r>
+      <w:r>
+        <w:rPr>
+          <w:vertAlign w:val="superscript"/>
+        </w:rPr>
+        <w:t xml:space="preserve">2</w:t>
+      </w:r>
+      <w:r>
+        <w:t xml:space="preserve">, Philippe Palmont</w:t>
+      </w:r>
+      <w:r>
+        <w:rPr>
+          <w:vertAlign w:val="superscript"/>
+        </w:rPr>
+        <w:t xml:space="preserve">2</w:t>
+      </w:r>
+      <w:r>
+        <w:t xml:space="preserve">, and Dietrich Plass</w:t>
+      </w:r>
+      <w:r>
+        <w:rPr>
+          <w:vertAlign w:val="superscript"/>
+        </w:rPr>
+        <w:t xml:space="preserve">1</w:t>
+      </w:r>
+    </w:p>
+    <w:p>
+      <w:pPr>
+        <w:pStyle w:val="FirstParagraph"/>
+      </w:pPr>
+      <w:r>
+        <w:rPr>
+          <w:vertAlign w:val="superscript"/>
+        </w:rPr>
+        <w:t xml:space="preserve">1</w:t>
+      </w:r>
+      <w:r>
+        <w:t xml:space="preserve"> </w:t>
+      </w:r>
+      <w:r>
+        <w:t xml:space="preserve">Environmental Hygiene, German Environment Agency, Berlin, Germany</w:t>
+      </w:r>
+      <w:r>
+        <w:br/>
+      </w:r>
+      <w:r>
+        <w:rPr>
+          <w:vertAlign w:val="superscript"/>
+        </w:rPr>
+        <w:t xml:space="preserve">2</w:t>
+      </w:r>
+      <w:r>
+        <w:t xml:space="preserve"> </w:t>
+      </w:r>
+      <w:r>
+        <w:t xml:space="preserve">Agence nationale de sécurité sanitaire, Maisons-Alfort, France</w:t>
       </w:r>
     </w:p>
     <w:bookmarkStart w:id="20" w:name="information-for-authors"/>
@@ -265,13 +306,13 @@
         <w:t xml:space="preserve">Abstract</w:t>
       </w:r>
     </w:p>
-    <w:bookmarkStart w:id="21" w:name="X67c926780bbff0042b1427218edfdcd75480539"/>
+    <w:bookmarkStart w:id="21" w:name="Xe1419aa8ec0d4918e6d611078ec644dda570126"/>
     <w:p>
       <w:pPr>
         <w:pStyle w:val="Heading3"/>
       </w:pPr>
       <w:r>
-        <w:t xml:space="preserve">Quantifying uncertainty: A methodological comparison of Bayesian and frequentist meta-analyses of lead exposure and children’s neurodevelopment</w:t>
+        <w:t xml:space="preserve">Quantifying uncertainty: A methodological comparison of Bayesian and frequentist meta-analyses of studies on lead exposure and children’s intelligence quotient</w:t>
       </w:r>
     </w:p>
     <w:bookmarkEnd w:id="21"/>
@@ -295,13 +336,13 @@
         <w:t xml:space="preserve"> </w:t>
       </w:r>
       <w:r>
-        <w:t xml:space="preserve">Yet, frequentist approaches dominate in environmental epidemiology.</w:t>
-      </w:r>
-      <w:r>
-        <w:t xml:space="preserve"> </w:t>
-      </w:r>
-      <w:r>
-        <w:t xml:space="preserve">We compared frequentist and Bayesian frameworks to evaluate differences in pooled effect estimates, uncertainty characterization, and applicability for risk assessment, using blood lead exposure and children’s neurodevelopment as a case study.</w:t>
+        <w:t xml:space="preserve">However, frequentist approaches currently dominate environmental epidemiology.</w:t>
+      </w:r>
+      <w:r>
+        <w:t xml:space="preserve"> </w:t>
+      </w:r>
+      <w:r>
+        <w:t xml:space="preserve">We compared frequentist and Bayesian frameworks to evaluate differences in pooled effect estimates, uncertainty characterization, and applicability for risk assessment, using lead exposure and children’s intelligence quotient (IQ) as a case study.</w:t>
       </w:r>
     </w:p>
     <w:bookmarkEnd w:id="22"/>
@@ -319,7 +360,7 @@
         <w:pStyle w:val="FirstParagraph"/>
       </w:pPr>
       <w:r>
-        <w:t xml:space="preserve">We systematically searched PubMed and Scopus for epidemiological studies on lead exposure and IQ score in children.</w:t>
+        <w:t xml:space="preserve">We systematically searched PubMed and Scopus for epidemiological studies on blood lead exposure and IQ score in children.</w:t>
       </w:r>
       <w:r>
         <w:t xml:space="preserve"> </w:t>
@@ -354,7 +395,7 @@
         <w:t xml:space="preserve"> </w:t>
       </w:r>
       <w:r>
-        <w:t xml:space="preserve">In both meta-analyses, we assumed a multilevel structure, used random-effects models and included identical effect estimates.</w:t>
+        <w:t xml:space="preserve">In both meta-analyses, we assumed a multilevel structure, used random-effects models and included the same effect estimates.</w:t>
       </w:r>
       <w:r>
         <w:t xml:space="preserve"> </w:t>
@@ -590,7 +631,7 @@
         <w:pStyle w:val="FirstParagraph"/>
       </w:pPr>
       <w:r>
-        <w:t xml:space="preserve">In this study, we provide updated pooled estimates for lead’s effect on children’s neurodevelopment.</w:t>
+        <w:t xml:space="preserve">In this study, we provide updated pooled estimates for the effect of lead exposure on children’s IQ.</w:t>
       </w:r>
       <w:r>
         <w:br/>
@@ -602,7 +643,7 @@
         <w:t xml:space="preserve"> </w:t>
       </w:r>
       <w:r>
-        <w:t xml:space="preserve">For risk assessment and policy making, this allows defining risk thresholds and calculating exceedance probabilities, enabling comparative assessments across pollutants.</w:t>
+        <w:t xml:space="preserve">For risk assessment and policy making, this allows probabilistic burden of disease assessments as well as defining risk thresholds and calculating exceedance probabilities, enabling comparative assessments across pollutants.</w:t>
       </w:r>
     </w:p>
     <w:p>

</xml_diff>

<commit_message>
changes to ISEE abstract
</commit_message>
<xml_diff>
--- a/abstracts/ISEE_2026.docx
+++ b/abstracts/ISEE_2026.docx
@@ -330,19 +330,19 @@
         <w:pStyle w:val="FirstParagraph"/>
       </w:pPr>
       <w:r>
-        <w:t xml:space="preserve">Bayesian meta-analysis provides probabilistic uncertainty quantification valuable for risk assessment and policy-making.</w:t>
-      </w:r>
-      <w:r>
-        <w:t xml:space="preserve"> </w:t>
-      </w:r>
-      <w:r>
-        <w:t xml:space="preserve">However, frequentist approaches currently dominate environmental epidemiology.</w:t>
-      </w:r>
-      <w:r>
-        <w:t xml:space="preserve"> </w:t>
-      </w:r>
-      <w:r>
-        <w:t xml:space="preserve">We compared frequentist and Bayesian frameworks to evaluate differences in pooled effect estimates, uncertainty characterization, and applicability for risk assessment, using lead exposure and children’s intelligence quotient (IQ) as a case study.</w:t>
+        <w:t xml:space="preserve">Quantifying uncertainty is crucial for risk assessment and policy-making but current meta-analytic approaches fall short in this regard.</w:t>
+      </w:r>
+      <w:r>
+        <w:t xml:space="preserve"> </w:t>
+      </w:r>
+      <w:r>
+        <w:t xml:space="preserve">Bayesian meta-analysis provides probabilistic uncertainty quantification.</w:t>
+      </w:r>
+      <w:r>
+        <w:t xml:space="preserve"> </w:t>
+      </w:r>
+      <w:r>
+        <w:t xml:space="preserve">To evaluate differences in uncertainty quantification and applicability for risk assessment, we compared frequentist and Bayesian frameworks, using lead exposure and children’s IQ as a case study.</w:t>
       </w:r>
     </w:p>
     <w:bookmarkEnd w:id="22"/>
@@ -422,6 +422,29 @@
         <m:sSup>
           <m:e>
             <m:r>
+              <m:t>τ</m:t>
+            </m:r>
+          </m:e>
+          <m:sup>
+            <m:r>
+              <m:t>2</m:t>
+            </m:r>
+          </m:sup>
+        </m:sSup>
+      </m:oMath>
+      <w:r>
+        <w:t xml:space="preserve"> </w:t>
+      </w:r>
+      <w:r>
+        <w:t xml:space="preserve">and</w:t>
+      </w:r>
+      <w:r>
+        <w:t xml:space="preserve"> </w:t>
+      </w:r>
+      <m:oMath>
+        <m:sSup>
+          <m:e>
+            <m:r>
               <m:t>I</m:t>
             </m:r>
           </m:e>
@@ -436,7 +459,7 @@
         <w:t xml:space="preserve"> </w:t>
       </w:r>
       <w:r>
-        <w:t xml:space="preserve">was estimated as a measure of between-study heterogeneity.</w:t>
+        <w:t xml:space="preserve">were estimated as measures of between-study heterogeneity.</w:t>
       </w:r>
     </w:p>
     <w:bookmarkEnd w:id="23"/>
@@ -631,7 +654,7 @@
         <w:pStyle w:val="FirstParagraph"/>
       </w:pPr>
       <w:r>
-        <w:t xml:space="preserve">In this study, we provide updated pooled estimates for the effect of lead exposure on children’s IQ.</w:t>
+        <w:t xml:space="preserve">We provide updated pooled estimates for the effect of lead exposure on children’s IQ.</w:t>
       </w:r>
       <w:r>
         <w:br/>

</xml_diff>

<commit_message>
version before clean-up for first deadline
</commit_message>
<xml_diff>
--- a/abstracts/ISEE_2026.docx
+++ b/abstracts/ISEE_2026.docx
@@ -483,7 +483,7 @@
         <w:t xml:space="preserve"> </w:t>
       </w:r>
       <w:r>
-        <w:t xml:space="preserve">The frequentist approach yielded a pooled estimate of -2.35 (95% confidence interval (CI): -3.65; -1.05) IQ points per unit increase in</w:t>
+        <w:t xml:space="preserve">The frequentist approach yielded a pooled estimate of -2.45 (95% confidence interval (CI): -3.7; -1.2) IQ points per unit increase in</w:t>
       </w:r>
       <w:r>
         <w:t xml:space="preserve"> </w:t>
@@ -512,7 +512,7 @@
         <w:t xml:space="preserve"> </w:t>
       </w:r>
       <w:r>
-        <w:t xml:space="preserve">The Bayesian model yielded a mean pooled estimate of -2.15 (95% credible interval (CrI): -3.48; -0.92).</w:t>
+        <w:t xml:space="preserve">The Bayesian model yielded a mean pooled estimate of -2.28 (95% credible interval (CrI): -3.56; -1.06).</w:t>
       </w:r>
       <w:r>
         <w:t xml:space="preserve"> </w:t>
@@ -541,7 +541,7 @@
         <w:t xml:space="preserve"> </w:t>
       </w:r>
       <w:r>
-        <w:t xml:space="preserve">= 3.79,</w:t>
+        <w:t xml:space="preserve">= 3.3,</w:t>
       </w:r>
       <w:r>
         <w:t xml:space="preserve"> </w:t>
@@ -568,7 +568,7 @@
         <w:t xml:space="preserve"> </w:t>
       </w:r>
       <w:r>
-        <w:t xml:space="preserve">= 98.5%; Bayesian:</w:t>
+        <w:t xml:space="preserve">= 85%; Bayesian:</w:t>
       </w:r>
       <w:r>
         <w:t xml:space="preserve"> </w:t>
@@ -591,7 +591,7 @@
         <w:t xml:space="preserve"> </w:t>
       </w:r>
       <w:r>
-        <w:t xml:space="preserve">= 4.32,</w:t>
+        <w:t xml:space="preserve">= 3.8,</w:t>
       </w:r>
       <w:r>
         <w:t xml:space="preserve"> </w:t>
@@ -618,7 +618,7 @@
         <w:t xml:space="preserve"> </w:t>
       </w:r>
       <w:r>
-        <w:t xml:space="preserve">= 98.3%).</w:t>
+        <w:t xml:space="preserve">= 83.3%).</w:t>
       </w:r>
       <w:r>
         <w:t xml:space="preserve"> </w:t>
@@ -660,7 +660,7 @@
         <w:t xml:space="preserve"> </w:t>
       </w:r>
       <w:r>
-        <w:t xml:space="preserve">The Bayesian approach provides full posterior distributions, enabling direct probability statements, for example about exceeding risk thresholds, and comparative assessments across pollutants.</w:t>
+        <w:t xml:space="preserve">The Bayesian approach provides posterior distributions, enabling direct probability statements, for example about exceeding risk thresholds, and comparative assessments across pollutants.</w:t>
       </w:r>
       <w:r>
         <w:t xml:space="preserve"> </w:t>

</xml_diff>